<commit_message>
Corregir consistencia de clientes, usuarios y reportes en primera revisión
</commit_message>
<xml_diff>
--- a/docs/ERS/Apendice-C-Diccionario-de-Datos-v2.0.docx
+++ b/docs/ERS/Apendice-C-Diccionario-de-Datos-v2.0.docx
@@ -54,6 +54,9 @@
           <w:rtl w:val="0"/>
         </w:rPr>
         <w:t xml:space="preserve">Este apéndice describe la persistencia del Sistema de Gestión de Taller Mecánico utilizada por la versión 253e7d6 más la migración RetirarVinculoCambioSinUso. Define las columnas, claves, relaciones, dominios y responsabilidades de integridad que sostienen la recepción, preparación técnica, autorización, ejecución, liquidación, cobro y entrega. Se corresponde con el DER SGTM versión 2.0 y sustituye la especificación anterior de 17 entidades.</w:t>
+      </w:r>
+      <w:r>
+        <w:t xml:space="preserve"> Esta revisión incorpora también ExigirTelefonoContactoCliente sobre la base de código 85c44c7.</w:t>
       </w:r>
     </w:p>
     <w:p>
@@ -4276,67 +4279,25 @@
             <w:vAlign w:val="top"/>
           </w:tcPr>
           <w:p>
-            <w:pPr>
-              <w:keepNext w:val="0"/>
-              <w:keepLines w:val="0"/>
-              <w:pageBreakBefore w:val="0"/>
-              <w:widowControl w:val="0"/>
-              <w:pBdr>
-                <w:top w:space="0" w:sz="0" w:val="nil"/>
-                <w:left w:space="0" w:sz="0" w:val="nil"/>
-                <w:bottom w:space="0" w:sz="0" w:val="nil"/>
-                <w:right w:space="0" w:sz="0" w:val="nil"/>
-                <w:between w:space="0" w:sz="0" w:val="nil"/>
-              </w:pBdr>
-              <w:shd w:fill="auto" w:val="clear"/>
-              <w:spacing w:after="0" w:before="0" w:line="240" w:lineRule="auto"/>
-              <w:ind w:left="0" w:right="0" w:firstLine="0"/>
-              <w:jc w:val="left"/>
-              <w:rPr/>
-            </w:pPr>
-            <w:r>
-              <w:rPr>
-                <w:rtl w:val="0"/>
-              </w:rPr>
-              <w:t xml:space="preserve">Sí</w:t>
-            </w:r>
-          </w:p>
-        </w:tc>
-        <w:tc>
-          <w:tcPr>
-            <w:shd w:fill="auto" w:val="clear"/>
-            <w:tcMar>
-              <w:top w:w="100.0" w:type="dxa"/>
-              <w:left w:w="100.0" w:type="dxa"/>
-              <w:bottom w:w="100.0" w:type="dxa"/>
-              <w:right w:w="100.0" w:type="dxa"/>
-            </w:tcMar>
-            <w:vAlign w:val="top"/>
-          </w:tcPr>
-          <w:p>
-            <w:pPr>
-              <w:keepNext w:val="0"/>
-              <w:keepLines w:val="0"/>
-              <w:pageBreakBefore w:val="0"/>
-              <w:widowControl w:val="0"/>
-              <w:pBdr>
-                <w:top w:space="0" w:sz="0" w:val="nil"/>
-                <w:left w:space="0" w:sz="0" w:val="nil"/>
-                <w:bottom w:space="0" w:sz="0" w:val="nil"/>
-                <w:right w:space="0" w:sz="0" w:val="nil"/>
-                <w:between w:space="0" w:sz="0" w:val="nil"/>
-              </w:pBdr>
-              <w:shd w:fill="auto" w:val="clear"/>
-              <w:spacing w:after="0" w:before="0" w:line="240" w:lineRule="auto"/>
-              <w:ind w:left="0" w:right="0" w:firstLine="0"/>
-              <w:jc w:val="left"/>
-              <w:rPr/>
-            </w:pPr>
-            <w:r>
-              <w:rPr>
-                <w:rtl w:val="0"/>
-              </w:rPr>
-              <w:t xml:space="preserve">Contacto telefónico opcional.</w:t>
+            <w:r>
+              <w:t>No</w:t>
+            </w:r>
+          </w:p>
+        </w:tc>
+        <w:tc>
+          <w:tcPr>
+            <w:shd w:fill="auto" w:val="clear"/>
+            <w:tcMar>
+              <w:top w:w="100.0" w:type="dxa"/>
+              <w:left w:w="100.0" w:type="dxa"/>
+              <w:bottom w:w="100.0" w:type="dxa"/>
+              <w:right w:w="100.0" w:type="dxa"/>
+            </w:tcMar>
+            <w:vAlign w:val="top"/>
+          </w:tcPr>
+          <w:p>
+            <w:r>
+              <w:t>Contacto obligatorio de 7 a 15 dígitos. Admite espacios, guiones, paréntesis y + inicial. Restricción CK_Clientes_TelefonoContacto.</w:t>
             </w:r>
           </w:p>
         </w:tc>
@@ -45968,6 +45929,9 @@
         </w:rPr>
         <w:t xml:space="preserve">__EFMigrationsHistory no es una entidad del negocio. Tiene MigrationId NVARCHAR(150) NOT NULL como PK y ProductVersion NVARCHAR(32) NOT NULL. Identifica las migraciones aplicadas. La versión de referencia utiliza 20261026155115_EsquemaInicialCircuitoActual y 20261028164124_SimplificarEjecucionTresEstados y 20261029090000_RetirarVinculoCambioSinUso. No se dibuja como relación de negocio ni se edita desde formularios.</w:t>
       </w:r>
+      <w:r>
+        <w:t xml:space="preserve"> Incluye 20261029190000_ExigirTelefonoContactoCliente.</w:t>
+      </w:r>
     </w:p>
     <w:p>
       <w:pPr>
@@ -46048,6 +46012,9 @@
           <w:rtl w:val="0"/>
         </w:rPr>
         <w:t xml:space="preserve">Fuente técnica: repositorio EnriqueRTG/taller-mecanico, base main 253e7d6 y limpieza RetirarVinculoCambioSinUso; entidades de Dominio, configuraciones de Persistencia, TallerDbContextModelSnapshot, migraciones indicadas, servicios de Aplicación y RegistroRespaldosSql. Los cambios posteriores al código requieren revisar nuevamente este diccionario y sus diagramas.</w:t>
+      </w:r>
+      <w:r>
+        <w:t xml:space="preserve"> Esta revisión incorpora también ExigirTelefonoContactoCliente sobre la base de código 85c44c7.</w:t>
       </w:r>
     </w:p>
     <w:p>

</xml_diff>